<commit_message>
Add exam questions Word file with endnote answers
일치/불일치 5문항 워드 파일 생성 스크립트 및 결과물 추가.
각 문항 발문에 미주(endnote)로 정답 번호 삽입.

https://claude.ai/code/session_01VdW8siqW43F2PBAG9fe45K
</commit_message>
<xml_diff>
--- a/배재고_일치불일치_문항.docx
+++ b/배재고_일치불일치_문항.docx
@@ -65,6 +65,14 @@
           <w:u w:val="none"/>
         </w:rPr>
         <w:t xml:space="preserve"> 것은? [3.1점]</w:t>
+      </w:r>
+      <w:r>
+        <w:rPr>
+          <w:rStyle w:val="EndnoteReference"/>
+          <w:vertAlign w:val="superscript"/>
+          <w:sz w:val="18"/>
+        </w:rPr>
+        <w:endnoteReference w:id="1"/>
       </w:r>
     </w:p>
     <w:p/>
@@ -180,6 +188,14 @@
         </w:rPr>
         <w:t xml:space="preserve"> 것을 2개 고르면? [3.5점]</w:t>
       </w:r>
+      <w:r>
+        <w:rPr>
+          <w:rStyle w:val="EndnoteReference"/>
+          <w:vertAlign w:val="superscript"/>
+          <w:sz w:val="18"/>
+        </w:rPr>
+        <w:endnoteReference w:id="2"/>
+      </w:r>
     </w:p>
     <w:p/>
     <w:p>
@@ -293,6 +309,14 @@
           <w:u w:val="none"/>
         </w:rPr>
         <w:t xml:space="preserve"> 고르면? [3.4점]</w:t>
+      </w:r>
+      <w:r>
+        <w:rPr>
+          <w:rStyle w:val="EndnoteReference"/>
+          <w:vertAlign w:val="superscript"/>
+          <w:sz w:val="18"/>
+        </w:rPr>
+        <w:endnoteReference w:id="3"/>
       </w:r>
     </w:p>
     <w:p/>
@@ -460,6 +484,14 @@
         </w:rPr>
         <w:t>다음 글에서 추론할 수 있는 것으로 가장 적절한 것은? [3.3점]</w:t>
       </w:r>
+      <w:r>
+        <w:rPr>
+          <w:rStyle w:val="EndnoteReference"/>
+          <w:vertAlign w:val="superscript"/>
+          <w:sz w:val="18"/>
+        </w:rPr>
+        <w:endnoteReference w:id="4"/>
+      </w:r>
     </w:p>
     <w:p/>
     <w:p>
@@ -573,6 +605,14 @@
           <w:u w:val="none"/>
         </w:rPr>
         <w:t xml:space="preserve"> 것은? [3.5점]</w:t>
+      </w:r>
+      <w:r>
+        <w:rPr>
+          <w:rStyle w:val="EndnoteReference"/>
+          <w:vertAlign w:val="superscript"/>
+          <w:sz w:val="18"/>
+        </w:rPr>
+        <w:endnoteReference w:id="5"/>
       </w:r>
     </w:p>
     <w:p/>
@@ -920,6 +960,14 @@
       <w:r>
         <w:rPr>
           <w:rFonts w:ascii="Times New Roman" w:hAnsi="Times New Roman" w:eastAsia="맑은 고딕"/>
+          <w:b w:val="0"/>
+          <w:sz w:val="22"/>
+          <w:u w:val="none"/>
+        </w:rPr>
+      </w:r>
+      <w:r>
+        <w:rPr>
+          <w:rFonts w:ascii="Times New Roman" w:hAnsi="Times New Roman" w:eastAsia="맑은 고딕"/>
           <w:b/>
           <w:sz w:val="22"/>
           <w:u w:val="none"/>
@@ -1018,25 +1066,7 @@
           <w:sz w:val="20"/>
           <w:u w:val="none"/>
         </w:rPr>
-        <w:t xml:space="preserve">지문은 "This </w:t>
-      </w:r>
-      <w:r>
-        <w:rPr>
-          <w:rFonts w:ascii="Times New Roman" w:hAnsi="Times New Roman" w:eastAsia="맑은 고딕"/>
-          <w:b/>
-          <w:sz w:val="20"/>
-          <w:u w:val="none"/>
-        </w:rPr>
-        <w:t>doesn't mean</w:t>
-      </w:r>
-      <w:r>
-        <w:rPr>
-          <w:rFonts w:ascii="Times New Roman" w:hAnsi="Times New Roman" w:eastAsia="맑은 고딕"/>
-          <w:b w:val="0"/>
-          <w:sz w:val="20"/>
-          <w:u w:val="none"/>
-        </w:rPr>
-        <w:t xml:space="preserve"> constantly reaching out with requests or updates but rather maintaining a friendly and consistent line of communication"이라고 명시했다. 즉, 자주 요청을 하며 연락하는 것이 관계를 강화한다는 것이 아니라, 우호적이고 일관된 소통을 유지하는 것이 핵심이다. ④번은 지문이 명시적으로 부정한 내용(requests를 통한 빈번한 연락)을 일치하는 것처럼 서술하였다.</w:t>
+        <w:t>지문은 "This doesn't mean constantly reaching out with requests or updates but rather maintaining a friendly and consistent line of communication"이라고 명시했다. ④번은 지문이 명시적으로 부정한 내용(requests를 통한 빈번한 연락)을 일치하는 것처럼 서술하였다.</w:t>
       </w:r>
     </w:p>
     <w:p>
@@ -1108,7 +1138,7 @@
           <w:sz w:val="20"/>
           <w:u w:val="none"/>
         </w:rPr>
-        <w:t xml:space="preserve">[해설 - ②] </w:t>
+        <w:t xml:space="preserve">[해설] </w:t>
       </w:r>
       <w:r>
         <w:rPr>
@@ -1117,7 +1147,9 @@
           <w:sz w:val="20"/>
           <w:u w:val="none"/>
         </w:rPr>
-        <w:t>지문은 후속 조치가 부족하면 관계가 정체(get stuck)된다고 했을 뿐, "지속적으로 후속 조치를 취하면 자연스럽게 깊어진다"고 하지 않았다. 인과 방향 뒤집기 + 무근거 추가.</w:t>
+        <w:t>② 지문은 후속 조치가 부족하면 관계가 정체(get stuck)된다고 했을 뿐, "자연스럽게 깊어진다"고 하지 않았다. 인과 방향 뒤집기 + 무근거 추가.</w:t>
+        <w:br/>
+        <w:t>⑤ 지문은 "you're thinking of them and are invested"라고 하여 투자의 주체가 '나(you)'이다. 선지는 "상대방이 자신에게 투자하고 있다"로 주체와 대상을 바꿔치기했다.</w:t>
       </w:r>
     </w:p>
     <w:p>
@@ -1131,7 +1163,7 @@
           <w:sz w:val="20"/>
           <w:u w:val="none"/>
         </w:rPr>
-        <w:t xml:space="preserve">[해설 - ⑤] </w:t>
+        <w:t xml:space="preserve">[오답 설계] </w:t>
       </w:r>
       <w:r>
         <w:rPr>
@@ -1140,7 +1172,7 @@
           <w:sz w:val="20"/>
           <w:u w:val="none"/>
         </w:rPr>
-        <w:t>지문은 "you're thinking of them and are invested"라고 하여 투자의 주체가 '나(you)'이다. 선지는 "상대방이 자신에게 투자하고 있다"로 주체와 대상을 바꿔치기했다.</w:t>
+        <w:t>② 인과 방향 뒤집기  ⑤ 주체 바꿔치기</w:t>
       </w:r>
     </w:p>
     <w:p/>
@@ -1189,7 +1221,7 @@
           <w:sz w:val="20"/>
           <w:u w:val="none"/>
         </w:rPr>
-        <w:t xml:space="preserve">[해설 - ㄷ 불일치] </w:t>
+        <w:t xml:space="preserve">[해설] </w:t>
       </w:r>
       <w:r>
         <w:rPr>
@@ -1198,7 +1230,9 @@
           <w:sz w:val="20"/>
           <w:u w:val="none"/>
         </w:rPr>
-        <w:t>지문은 "even if you haven't spoken in a while"이라 하여 오래 연락 안 한 사람에게도 공유하라고 했다. 선지의 "only with those you regularly keep in touch with"는 한정사 only를 삽입하여 의미를 반대로 전환.</w:t>
+        <w:t>ㄷ 불일치: "only with those you regularly keep in touch with"는 한정사 only를 삽입하여 의미를 반대로 전환.</w:t>
+        <w:br/>
+        <w:t>ㄹ 불일치: "conscious effort(의식적 노력)"와 "naturally without much thought"는 정반대. 반의어 교체.</w:t>
       </w:r>
     </w:p>
     <w:p>
@@ -1212,7 +1246,7 @@
           <w:sz w:val="20"/>
           <w:u w:val="none"/>
         </w:rPr>
-        <w:t xml:space="preserve">[해설 - ㄹ 불일치] </w:t>
+        <w:t xml:space="preserve">[오답 설계] </w:t>
       </w:r>
       <w:r>
         <w:rPr>
@@ -1221,7 +1255,7 @@
           <w:sz w:val="20"/>
           <w:u w:val="none"/>
         </w:rPr>
-        <w:t>지문의 "conscious effort(의식적 노력)"와 선지의 "naturally without much thought(자연스럽게 별 생각 없이)"는 정반대. 반의어 교체 함정.</w:t>
+        <w:t>ㄷ 한정사 only 삽입  ㄹ 반의어 교체</w:t>
       </w:r>
     </w:p>
     <w:p/>
@@ -1279,7 +1313,30 @@
           <w:sz w:val="20"/>
           <w:u w:val="none"/>
         </w:rPr>
-        <w:t>④ "conscious effort" + "even if you haven't spoken in a while"에서, 즉각적 이유가 없어도 지속적 관심이 필요하다는 추론이 가능하다. ① stuck(정체)≠end permanently(영구 종료)로 정도 과장. ②③ 지문이 부정한 내용(requests)을 긍정적으로 전환. ⑤ "only when ~ both parties"라는 이중 조건은 지문에 없음.</w:t>
+        <w:t>④ "conscious effort" + "even if you haven't spoken in a while"에서, 즉각적 이유가 없어도 지속적 관심이 필요하다는 추론이 가능. ① stuck≠end permanently 정도 과장. ②③ 지문이 부정한 내용을 긍정적으로 전환. ⑤ "only when ~ both parties" 무근거 조건 추가.</w:t>
+      </w:r>
+    </w:p>
+    <w:p>
+      <w:pPr>
+        <w:ind w:left="170"/>
+      </w:pPr>
+      <w:r>
+        <w:rPr>
+          <w:rFonts w:ascii="Times New Roman" w:hAnsi="Times New Roman" w:eastAsia="맑은 고딕"/>
+          <w:b/>
+          <w:sz w:val="20"/>
+          <w:u w:val="none"/>
+        </w:rPr>
+        <w:t xml:space="preserve">[오답 설계] </w:t>
+      </w:r>
+      <w:r>
+        <w:rPr>
+          <w:rFonts w:ascii="Times New Roman" w:hAnsi="Times New Roman" w:eastAsia="맑은 고딕"/>
+          <w:b w:val="0"/>
+          <w:sz w:val="20"/>
+          <w:u w:val="none"/>
+        </w:rPr>
+        <w:t>① 정도 과장  ②③ 부정 내용 긍정화  ⑤ 무근거 조건 추가</w:t>
       </w:r>
     </w:p>
     <w:p/>
@@ -1314,7 +1371,7 @@
           <w:sz w:val="20"/>
           <w:u w:val="none"/>
         </w:rPr>
-        <w:t>대화문이라는 비전형적 형식에서 지문의 세부 조건을 정밀하게 판별하는 능력 평가. 대화의 자연스러운 흐름 속에 무근거 조건을 삽입한 함정.</w:t>
+        <w:t>대화문 형식에서 지문의 세부 조건을 정밀하게 판별하는 능력 평가.</w:t>
       </w:r>
     </w:p>
     <w:p>
@@ -1337,9 +1394,33 @@
           <w:sz w:val="20"/>
           <w:u w:val="none"/>
         </w:rPr>
-        <w:t>지문은 "share it with them, even if you haven't spoken in a while"이라고 하여 사전 확인 없이도 공유를 권장한다. ④의 "but only after you've confirmed that the other person wants to receive it"은 지문에 없는 조건을 추가한 것이다. 대화 맥락상 "배려하는 행동"으로 읽혀 자연스러워 보이지만, 지문은 이런 조건을 전혀 요구하지 않는다.</w:t>
+        <w:t>지문은 사전 확인 없이도 공유를 권장한다. ④의 "but only after you've confirmed that the other person wants to receive it"은 지문에 없는 조건을 추가한 것이다.</w:t>
       </w:r>
     </w:p>
+    <w:p>
+      <w:pPr>
+        <w:ind w:left="170"/>
+      </w:pPr>
+      <w:r>
+        <w:rPr>
+          <w:rFonts w:ascii="Times New Roman" w:hAnsi="Times New Roman" w:eastAsia="맑은 고딕"/>
+          <w:b/>
+          <w:sz w:val="20"/>
+          <w:u w:val="none"/>
+        </w:rPr>
+        <w:t xml:space="preserve">[오답 설계] </w:t>
+      </w:r>
+      <w:r>
+        <w:rPr>
+          <w:rFonts w:ascii="Times New Roman" w:hAnsi="Times New Roman" w:eastAsia="맑은 고딕"/>
+          <w:b w:val="0"/>
+          <w:sz w:val="20"/>
+          <w:u w:val="none"/>
+        </w:rPr>
+        <w:t>무근거 조건 추가 + 대화문 경계심 저하 효과 활용</w:t>
+      </w:r>
+    </w:p>
+    <w:p/>
     <w:sectPr>
       <w:pgSz w:w="12240" w:h="15840"/>
       <w:pgMar w:top="1134" w:right="1417" w:bottom="1134" w:left="1417" w:header="720" w:footer="720" w:gutter="0"/>
@@ -1348,6 +1429,110 @@
     </w:sectPr>
   </w:body>
 </w:document>
+</file>
+
+<file path=word/endnotes.xml><?xml version="1.0" encoding="utf-8"?>
+<w:endnotes xmlns:wpc="http://schemas.microsoft.com/office/word/2010/wordprocessingCanvas" xmlns:mo="http://schemas.microsoft.com/office/mac/office/2008/main" xmlns:mc="http://schemas.openxmlformats.org/markup-compatibility/2006" xmlns:mv="urn:schemas-microsoft-com:mac:vml" xmlns:o="urn:schemas-microsoft-com:office:office" xmlns:r="http://schemas.openxmlformats.org/officeDocument/2006/relationships" xmlns:m="http://schemas.openxmlformats.org/officeDocument/2006/math" xmlns:v="urn:schemas-microsoft-com:vml" xmlns:wp14="http://schemas.microsoft.com/office/word/2010/wordprocessingDrawing" xmlns:wp="http://schemas.openxmlformats.org/drawingml/2006/wordprocessingDrawing" xmlns:w10="urn:schemas-microsoft-com:office:word" xmlns:w="http://schemas.openxmlformats.org/wordprocessingml/2006/main" xmlns:w14="http://schemas.microsoft.com/office/word/2010/wordml" xmlns:wpg="http://schemas.microsoft.com/office/word/2010/wordprocessingGroup" xmlns:wpi="http://schemas.microsoft.com/office/word/2010/wordprocessingInk" xmlns:wne="http://schemas.microsoft.com/office/word/2006/wordml" xmlns:wps="http://schemas.microsoft.com/office/word/2010/wordprocessingShape" mc:Ignorable="w14 wp14">
+  <w:endnote w:type="separator" w:id="-1">
+    <w:p>
+      <w:r>
+        <w:separator/>
+      </w:r>
+    </w:p>
+  </w:endnote>
+  <w:endnote w:type="continuationSeparator" w:id="0">
+    <w:p>
+      <w:r>
+        <w:continuationSeparator/>
+      </w:r>
+    </w:p>
+  </w:endnote>
+  <w:endnote w:id="1">
+    <w:p>
+      <w:r>
+        <w:rPr>
+          <w:rStyle w:val="EndnoteReference"/>
+        </w:rPr>
+        <w:endnoteRef/>
+      </w:r>
+      <w:r>
+        <w:t xml:space="preserve"> 정답: ④</w:t>
+        <w:rPr>
+          <w:rFonts w:eastAsia="맑은 고딕"/>
+          <w:sz w:val="18"/>
+        </w:rPr>
+      </w:r>
+    </w:p>
+  </w:endnote>
+  <w:endnote w:id="2">
+    <w:p>
+      <w:r>
+        <w:rPr>
+          <w:rStyle w:val="EndnoteReference"/>
+        </w:rPr>
+        <w:endnoteRef/>
+      </w:r>
+      <w:r>
+        <w:t xml:space="preserve"> 정답: ②, ⑤</w:t>
+        <w:rPr>
+          <w:rFonts w:eastAsia="맑은 고딕"/>
+          <w:sz w:val="18"/>
+        </w:rPr>
+      </w:r>
+    </w:p>
+  </w:endnote>
+  <w:endnote w:id="3">
+    <w:p>
+      <w:r>
+        <w:rPr>
+          <w:rStyle w:val="EndnoteReference"/>
+        </w:rPr>
+        <w:endnoteRef/>
+      </w:r>
+      <w:r>
+        <w:t xml:space="preserve"> 정답: ④ (ㄱ, ㄴ, ㅁ)</w:t>
+        <w:rPr>
+          <w:rFonts w:eastAsia="맑은 고딕"/>
+          <w:sz w:val="18"/>
+        </w:rPr>
+      </w:r>
+    </w:p>
+  </w:endnote>
+  <w:endnote w:id="4">
+    <w:p>
+      <w:r>
+        <w:rPr>
+          <w:rStyle w:val="EndnoteReference"/>
+        </w:rPr>
+        <w:endnoteRef/>
+      </w:r>
+      <w:r>
+        <w:t xml:space="preserve"> 정답: ④</w:t>
+        <w:rPr>
+          <w:rFonts w:eastAsia="맑은 고딕"/>
+          <w:sz w:val="18"/>
+        </w:rPr>
+      </w:r>
+    </w:p>
+  </w:endnote>
+  <w:endnote w:id="5">
+    <w:p>
+      <w:r>
+        <w:rPr>
+          <w:rStyle w:val="EndnoteReference"/>
+        </w:rPr>
+        <w:endnoteRef/>
+      </w:r>
+      <w:r>
+        <w:t xml:space="preserve"> 정답: ④</w:t>
+        <w:rPr>
+          <w:rFonts w:eastAsia="맑은 고딕"/>
+          <w:sz w:val="18"/>
+        </w:rPr>
+      </w:r>
+    </w:p>
+  </w:endnote>
+</w:endnotes>
 </file>
 
 <file path=word/numbering.xml><?xml version="1.0" encoding="utf-8"?>

</xml_diff>